<commit_message>
Digest: workflows in the Features section, and six statements corrected before sending
The day overtook the text: Preferences is thirteen pages not eleven, Apply
Patch and the Word redline engine are finished rather than in progress, the
suite count moved again, and Next still promised twelve audit items when
eleven are closed. Also the Features section and its capture now cover the
workflow presets, and the wording says ticking rather than choosing since
workflows combine.

Co-Authored-By: Claude Opus 5 <noreply@anthropic.com>
</commit_message>
<xml_diff>
--- a/docs/digests/2026-09-09-digest.docx
+++ b/docs/digests/2026-09-09-digest.docx
@@ -1710,7 +1710,15 @@
         <w:pStyle w:val="FirstParagraph"/>
       </w:pPr>
       <w:r>
-        <w:t xml:space="preserve">The suite now carries twenty-five panes in seven groups. Someone who only reads and drafts meets twenty surfaces they will never open. So Preferences now has a Features page: every pane and every group is a switch.</w:t>
+        <w:t xml:space="preserve">The suite now carries twenty-six panes in seven groups. Someone who only reads and drafts meets twenty surfaces they will never open. So Preferences now has a Features page: every pane and every group is a switch.</w:t>
+      </w:r>
+    </w:p>
+    <w:p>
+      <w:pPr>
+        <w:pStyle w:val="BodyText"/>
+      </w:pPr>
+      <w:r>
+        <w:t xml:space="preserve">Above those switches sits a row of workflows — translating, editing, reading and study, cataloguing, input and proofreading, learning Tibetan. Tick the ways you work, and the tool turns on what they need between them; tick two and you get both. They are a fast way to set the switches, not a lock: everything below stays yours to change afterwards, and the page says so. I want to be plain that the six are coarse first guesses at how people work. The session with our editor and the one-on-ones with the translators are exactly where they will be corrected.</w:t>
       </w:r>
     </w:p>
     <w:p>
@@ -1730,7 +1738,7 @@
           <wp:inline>
             <wp:extent cx="5334000" cy="3897923"/>
             <wp:effectExtent b="0" l="0" r="0" t="0"/>
-            <wp:docPr descr="Preferences ▸ Features: every pane and group is a switch, and the first thing the page says is that nothing is deleted." title="" id="51" name="Picture"/>
+            <wp:docPr descr="Preferences ▸ Features: the workflows across the top, every pane and group as a switch below, and the first thing the page says is that nothing is deleted." title="" id="51" name="Picture"/>
             <a:graphic>
               <a:graphicData uri="http://schemas.openxmlformats.org/drawingml/2006/picture">
                 <pic:pic>
@@ -1773,7 +1781,7 @@
         <w:pStyle w:val="ImageCaption"/>
       </w:pPr>
       <w:r>
-        <w:t xml:space="preserve">Preferences ▸ Features: every pane and group is a switch, and the first thing the page says is that nothing is deleted.</w:t>
+        <w:t xml:space="preserve">Preferences ▸ Features: the workflows across the top, every pane and group as a switch below, and the first thing the page says is that nothing is deleted.</w:t>
       </w:r>
     </w:p>
     <w:bookmarkEnd w:id="53"/>
@@ -2205,6 +2213,18 @@
       </w:pPr>
       <w:r>
         <w:t xml:space="preserve">The idiom register holds no English of its own. English is Geshe Michael’s; the tool shows his renderings from his own courses and labels a translator’s proposed English as the translator’s until he rules.</w:t>
+      </w:r>
+    </w:p>
+    <w:p>
+      <w:pPr>
+        <w:pStyle w:val="Compact"/>
+        <w:numPr>
+          <w:ilvl w:val="0"/>
+          <w:numId w:val="1006"/>
+        </w:numPr>
+      </w:pPr>
+      <w:r>
+        <w:t xml:space="preserve">Workflows can be combined rather than chosen between. Someone who both translates and edits ticks both and gets what either needs, and every switch stays theirs afterwards. The six shipped ones are coarse first guesses; the role sessions will correct them.</w:t>
       </w:r>
     </w:p>
     <w:p>
@@ -2934,6 +2954,40 @@
         <w:t xml:space="preserve"> </w:t>
       </w:r>
       <w:r>
+        <w:t xml:space="preserve">the six workflows are my first guess at how people work. The</w:t>
+      </w:r>
+      <w:r>
+        <w:t xml:space="preserve"> </w:t>
+      </w:r>
+      <w:r>
+        <w:t xml:space="preserve">editor’s session and the translators’ one-on-ones should correct them,</w:t>
+      </w:r>
+      <w:r>
+        <w:t xml:space="preserve"> </w:t>
+      </w:r>
+      <w:r>
+        <w:t xml:space="preserve">and anyone can tell me now if one of the six is wrong.</w:t>
+      </w:r>
+    </w:p>
+    <w:p>
+      <w:pPr>
+        <w:pStyle w:val="Compact"/>
+        <w:numPr>
+          <w:ilvl w:val="0"/>
+          <w:numId w:val="1007"/>
+        </w:numPr>
+      </w:pPr>
+      <w:r>
+        <w:rPr>
+          <w:b/>
+          <w:bCs/>
+        </w:rPr>
+        <w:t xml:space="preserve">New:</w:t>
+      </w:r>
+      <w:r>
+        <w:t xml:space="preserve"> </w:t>
+      </w:r>
+      <w:r>
         <w:t xml:space="preserve">the five idioms in the register are all waiting on Geshe</w:t>
       </w:r>
       <w:r>

</xml_diff>

<commit_message>
Digest: correct the five statements the day overtook
Preferences is thirteen pages, not eleven; Apply Patch and the Word redline
engine are finished rather than in progress; a stale suite count in the
audit paragraph; and Next still promised twelve open audit items when
eleven are closed.

Co-Authored-By: Claude Opus 5 <noreply@anthropic.com>
</commit_message>
<xml_diff>
--- a/docs/digests/2026-09-09-digest.docx
+++ b/docs/digests/2026-09-09-digest.docx
@@ -567,19 +567,19 @@
         <w:t xml:space="preserve"> </w:t>
       </w:r>
       <w:r>
-        <w:t xml:space="preserve">A Word-style window of eleven pages behind an icon</w:t>
-      </w:r>
-      <w:r>
-        <w:t xml:space="preserve"> </w:t>
-      </w:r>
-      <w:r>
-        <w:t xml:space="preserve">grid with search: General, View, House Style, Lookup, Compare, Team,</w:t>
-      </w:r>
-      <w:r>
-        <w:t xml:space="preserve"> </w:t>
-      </w:r>
-      <w:r>
-        <w:t xml:space="preserve">Locations, Privacy, Colours, Shortcuts and Quick Access. Every switch</w:t>
+        <w:t xml:space="preserve">A Word-style window behind an icon grid with search, now</w:t>
+      </w:r>
+      <w:r>
+        <w:t xml:space="preserve"> </w:t>
+      </w:r>
+      <w:r>
+        <w:t xml:space="preserve">thirteen pages: General, View, House Style, Lookup, Compare, Versions,</w:t>
+      </w:r>
+      <w:r>
+        <w:t xml:space="preserve"> </w:t>
+      </w:r>
+      <w:r>
+        <w:t xml:space="preserve">Team, Locations, Privacy, Colours, Shortcuts, Quick Access and Features. Every switch</w:t>
       </w:r>
       <w:r>
         <w:t xml:space="preserve"> </w:t>
@@ -1452,13 +1452,13 @@
           <w:b/>
           <w:bCs/>
         </w:rPr>
-        <w:t xml:space="preserve">Apply Patch</w:t>
-      </w:r>
-      <w:r>
-        <w:t xml:space="preserve"> </w:t>
-      </w:r>
-      <w:r>
-        <w:t xml:space="preserve">(in progress at the time of this draft). A corrector’s unified diff loaded against my copy: each hunk placed exactly, with an offset, with loosened context, already applied, or rejected — five distinct verdicts, never folded into one. The result is a diff in the Compare pane, the rejected hunks go to a .rej file for the corrector, and the previous text is kept as a version before anything is written.</w:t>
+        <w:t xml:space="preserve">Apply Patch.</w:t>
+      </w:r>
+      <w:r>
+        <w:t xml:space="preserve"> </w:t>
+      </w:r>
+      <w:r>
+        <w:t xml:space="preserve">A corrector’s unified diff loaded against my copy: each hunk placed exactly, with an offset, with loosened context, already applied, or rejected — five distinct verdicts, never folded into one. The result is a diff in the Compare pane, the rejected hunks go to a .rej file for the corrector, and the previous text is kept as a version before anything is written.</w:t>
       </w:r>
     </w:p>
     <w:p>
@@ -1525,13 +1525,13 @@
           <w:b/>
           <w:bCs/>
         </w:rPr>
-        <w:t xml:space="preserve">Tracked changes for Word</w:t>
-      </w:r>
-      <w:r>
-        <w:t xml:space="preserve"> </w:t>
-      </w:r>
-      <w:r>
-        <w:t xml:space="preserve">(engine in progress). The differences between two drafts written as a Word document with real revision marks, so Geshe Michael can accept or reject each change in Word itself. The first paragraph says what the file compares, under what rules, who ran it, and that the marks are machine-computed. I will not add it to the Save Report menu until I have opened a sample in Word and recorded that Accept All gives text B and Reject All gives text A.</w:t>
+        <w:t xml:space="preserve">Tracked changes for Word.</w:t>
+      </w:r>
+      <w:r>
+        <w:t xml:space="preserve"> </w:t>
+      </w:r>
+      <w:r>
+        <w:t xml:space="preserve">The differences between two drafts written as a Word document with real revision marks, so Geshe Michael can accept or reject each change in Word itself. The first paragraph says what the file compares, under what rules, who ran it, and that the marks are machine-computed. I will not add it to the Save Report menu until I have opened a sample in Word and recorded that Accept All gives text B and Reject All gives text A.</w:t>
       </w:r>
     </w:p>
     <w:bookmarkEnd w:id="43"/>
@@ -1549,7 +1549,7 @@
         <w:pStyle w:val="FirstParagraph"/>
       </w:pPr>
       <w:r>
-        <w:t xml:space="preserve">The pane-by-pane release audit had left twelve items on the main window needing a ruling. I closed eleven today: the one headless probe that ran outside the safety guard now runs inside it; a dead window-size call is gone; the Sanskrit glyph check, which used to run only by hand, is a test gate (109 suites now); a Quick Access pin whose command was renamed shows as</w:t>
+        <w:t xml:space="preserve">The pane-by-pane release audit had left twelve items on the main window needing a ruling. I closed eleven today: the one headless probe that ran outside the safety guard now runs inside it; a dead window-size call is gone; the Sanskrit glyph check, which used to run only by hand, is a test gate; a Quick Access pin whose command was renamed shows as</w:t>
       </w:r>
       <w:r>
         <w:t xml:space="preserve"> </w:t>
@@ -3046,31 +3046,31 @@
         <w:pStyle w:val="FirstParagraph"/>
       </w:pPr>
       <w:r>
-        <w:t xml:space="preserve">Build out the Study pane’s four engines in the critic’s order; press a</w:t>
-      </w:r>
-      <w:r>
-        <w:t xml:space="preserve"> </w:t>
-      </w:r>
-      <w:r>
-        <w:t xml:space="preserve">fresh build with the whole batch and relaunch it on the desktop; clear the</w:t>
-      </w:r>
-      <w:r>
-        <w:t xml:space="preserve"> </w:t>
-      </w:r>
-      <w:r>
-        <w:t xml:space="preserve">twelve release-audit items that still need a ruling; then the Map pane</w:t>
-      </w:r>
-      <w:r>
-        <w:t xml:space="preserve"> </w:t>
-      </w:r>
-      <w:r>
-        <w:t xml:space="preserve">study and the second analysis batch (repeated passages, collation of many</w:t>
-      </w:r>
-      <w:r>
-        <w:t xml:space="preserve"> </w:t>
-      </w:r>
-      <w:r>
-        <w:t xml:space="preserve">witnesses, the citation and reference bank).</w:t>
+        <w:t xml:space="preserve">Build out the Study pane’s four engines in the order the critic set: what</w:t>
+      </w:r>
+      <w:r>
+        <w:t xml:space="preserve"> </w:t>
+      </w:r>
+      <w:r>
+        <w:t xml:space="preserve">a text counts, what it repeats, which texts share material with it, and the</w:t>
+      </w:r>
+      <w:r>
+        <w:t xml:space="preserve"> </w:t>
+      </w:r>
+      <w:r>
+        <w:t xml:space="preserve">people, works and dates it names. Then the reference and citation bank, and</w:t>
+      </w:r>
+      <w:r>
+        <w:t xml:space="preserve"> </w:t>
+      </w:r>
+      <w:r>
+        <w:t xml:space="preserve">the map study. The one release-audit item still open, and the questions</w:t>
+      </w:r>
+      <w:r>
+        <w:t xml:space="preserve"> </w:t>
+      </w:r>
+      <w:r>
+        <w:t xml:space="preserve">above, wait on your rulings.</w:t>
       </w:r>
     </w:p>
     <w:bookmarkEnd w:id="68"/>

</xml_diff>